<commit_message>
feat: raise self-review PASS threshold to 85, apply fix iteration 2 to all demos
Raised PASS threshold from 80 to 85 in self-review SKILL.md to ensure
manuscripts get more thorough polishing before the fix loop exits.

All 3 demos now show full 2-iteration fix loops:
- Demo 01 (Wisconsin BC): 74 → 80 → 83 (REVISE, limit reached)
- Demo 02 (Metafor BCG): 72 → 79 → 82 (REVISE, limit reached)
- Demo 03 (NHANES Obesity): 75 → 82 → 85 (PASS at threshold)

Demo 01/02 demonstrate realistic "auto-fix limit reached" behavior where
remaining issues (calibration analysis, GRADE, RoB) genuinely require
human intervention. Demo 03 shows the happy path reaching PASS.

Co-Authored-By: Claude Opus 4.6 (1M context) <noreply@anthropic.com>
</commit_message>
<xml_diff>
--- a/demo/01_wisconsin_bc/manuscript_final.docx
+++ b/demo/01_wisconsin_bc/manuscript_final.docx
@@ -970,7 +970,7 @@
         <w:pStyle w:val="BodyText"/>
       </w:pPr>
       <w:r>
-        <w:t xml:space="preserve">Data are from the held-out test set (n = 114; 42 malignant, 72 benign). AUC 95% CIs from bootstrap resampling (2000 iterations). PPV = positive predictive value; NPV = negative predictive value.</w:t>
+        <w:t xml:space="preserve">Data are from the held-out test set (n = 114; 42 malignant, 72 benign). AUC 95% CIs from bootstrap resampling (2000 iterations). Confidence intervals for sensitivity, specificity, PPV, and NPV were not computed; Wilson score intervals should be added in future analyses. PPV = positive predictive value; NPV = negative predictive value.</w:t>
       </w:r>
     </w:p>
     <w:p>
@@ -1109,6 +1109,14 @@
         <w:t xml:space="preserve">The LR and SVM classifiers each misclassified 3 malignant cases as benign (false negatives), while the RF classifier misclassified 4 malignant cases. The LR classifier produced 1 false positive (benign classified as malignant), whereas the RF and SVM classifiers produced no false positives.</w:t>
       </w:r>
     </w:p>
+    <w:p>
+      <w:pPr>
+        <w:pStyle w:val="BodyText"/>
+      </w:pPr>
+      <w:r>
+        <w:t xml:space="preserve">Model calibration was not assessed in this study; predicted probabilities were used only for binary classification at the 0.5 threshold. Confidence intervals for sensitivity, specificity, PPV, and NPV were not computed; future analyses should include Wilson score intervals for all proportion-based metrics.</w:t>
+      </w:r>
+    </w:p>
     <w:bookmarkEnd w:id="32"/>
     <w:bookmarkEnd w:id="33"/>
     <w:bookmarkStart w:id="34" w:name="discussion"/>
@@ -1157,7 +1165,7 @@
         <w:pStyle w:val="BodyText"/>
       </w:pPr>
       <w:r>
-        <w:t xml:space="preserve">The primary limitation is the use of a single-institution dataset without external validation, which restricts the generalizability of these findings. The absence of external validation limits generalizability; the random train-test split within a single institution provides only internal validity, and prospective or multi-institutional validation is needed before clinical deployment. Second, the clinical variables available in the dataset were limited to age and sex, precluding evaluation of how additional clinical information (e.g., imaging findings, family history) might improve classification performance. Third, the use of a public benchmark dataset with pre-extracted features does not fully replicate the end-to-end clinical workflow, which would include FNA sample preparation, image acquisition, and feature extraction steps, each of which introduces additional sources of variability.</w:t>
+        <w:t xml:space="preserve">Model calibration was not formally assessed in this study, which limits the clinical utility of predicted probabilities. Future work should include calibration plots and Brier scores to evaluate reliability of probability estimates. The primary limitation is the use of a single-institution dataset without external validation, which restricts the generalizability of these findings. The absence of external validation limits generalizability; the random train-test split within a single institution provides only internal validity, and prospective or multi-institutional validation is needed before clinical deployment. Second, the clinical variables available in the dataset were limited to age and sex, precluding evaluation of how additional clinical information (e.g., imaging findings, family history) might improve classification performance. Third, the use of a public benchmark dataset with pre-extracted features does not fully replicate the end-to-end clinical workflow, which would include FNA sample preparation, image acquisition, and feature extraction steps, each of which introduces additional sources of variability.</w:t>
       </w:r>
     </w:p>
     <w:p>

</xml_diff>